<commit_message>
Enhance credit pack schema and seeding with priceCents field; update related documents
- Added priceCents field to CreateCreditPackBodySchema for validation.
- Updated Athlete and Match models to include new relationships for match participants.
- Modified seed data to include priceCents for credit packs.
- Updated selectors to include priceCents in credit pack queries.
- Revised documentation files to reflect changes in the schema.
</commit_message>
<xml_diff>
--- a/docs/Flows.docx
+++ b/docs/Flows.docx
@@ -1358,7 +1358,7 @@
                 <w:sz w:val="21"/>
                 <w:szCs w:val="21"/>
               </w:rPr>
-              <w:t xml:space="preserve">Configures the league rules: ranking mode (Overall or Head-to-Head), roster size, number of starters per gameweek, Fantacoin budget per team, entry fee in credits (or sets it as free), maximum number of members, and prize descriptions for 1st, 2nd, and 3rd place.</w:t>
+              <w:t xml:space="preserve">Configures the league rules: ranking mode (Overall only — Head-to-Head is not available for Public Leagues), roster size, number of starters per gameweek, Fantacoin budget per team, entry fee in credits (or sets it as free), maximum number of members, and prize descriptions for 1st, 2nd, and 3rd place.</w:t>
             </w:r>
           </w:p>
         </w:tc>
@@ -7798,7 +7798,7 @@
                 <w:sz w:val="21"/>
                 <w:szCs w:val="21"/>
               </w:rPr>
-              <w:t xml:space="preserve">Auto-generates subsequent bracket matchups as results are confirmed — through the pool phase, Round of 8, and knockout rounds.</w:t>
+              <w:t xml:space="preserve">Auto-generates subsequent bracket matchups as results are confirmed — through the pool phase, Round of 12, and knockout rounds.</w:t>
             </w:r>
           </w:p>
         </w:tc>
@@ -7923,7 +7923,7 @@
                 <w:sz w:val="21"/>
                 <w:szCs w:val="21"/>
               </w:rPr>
-              <w:t xml:space="preserve">Once the pool phase is complete, manually defines the Round of 8 pairings. All further matchups are generated automatically.</w:t>
+              <w:t xml:space="preserve">Once the pool phase is complete, reviews the pool results. The System auto-generates all Round of 12 and subsequent knockout pairings from this point onward.</w:t>
             </w:r>
           </w:p>
         </w:tc>

</xml_diff>